<commit_message>
Document browser and desktop setup and add user manual
</commit_message>
<xml_diff>
--- a/current release/SETUP_GUIDE.docx
+++ b/current release/SETUP_GUIDE.docx
@@ -139,7 +139,255 @@
     </w:p>
     <w:p>
       <w:r>
-        <w:t>Copy the entire contents of universal-custom-instructions.md. Use the same text in each product; keep project-specific details in that project's files. A cloud-only chat cannot read a local path merely because the instructions name it.</w:t>
+        <w:t>Copy the entire contents of universal-custom-instructions.md into the appropriate setting below. On ChatGPT Free or Go, use the short version if the full text exceeds the 1,500-character limit. Keep project-specific details in that project's files. A cloud-only chat cannot read a local path merely because the instructions name it.</w:t>
+      </w:r>
+    </w:p>
+    <w:p>
+      <w:pPr>
+        <w:pStyle w:val="Heading2"/>
+      </w:pPr>
+      <w:r>
+        <w:t>Browser-based assistants</w:t>
+      </w:r>
+    </w:p>
+    <w:p>
+      <w:r>
+        <w:t>These account settings store instructions in the online service. They do not grant access to files on your computer. Start a fresh chat after saving instructions.</w:t>
+      </w:r>
+    </w:p>
+    <w:tbl>
+      <w:tblPr>
+        <w:tblStyle w:val="TableGrid"/>
+        <w:tblW w:type="auto" w:w="0"/>
+        <w:jc w:val="center"/>
+        <w:tblLook w:firstColumn="1" w:firstRow="1" w:lastColumn="0" w:lastRow="0" w:noHBand="0" w:noVBand="1" w:val="04A0"/>
+      </w:tblPr>
+      <w:tblGrid>
+        <w:gridCol w:w="5083"/>
+        <w:gridCol w:w="5083"/>
+      </w:tblGrid>
+      <w:tr>
+        <w:trPr>
+          <w:tblHeader w:val="true"/>
+        </w:trPr>
+        <w:tc>
+          <w:tcPr>
+            <w:tcW w:type="dxa" w:w="5083"/>
+          </w:tcPr>
+          <w:p>
+            <w:pPr>
+              <w:spacing w:after="40"/>
+            </w:pPr>
+            <w:r>
+              <w:rPr>
+                <w:b/>
+                <w:sz w:val="15"/>
+              </w:rPr>
+              <w:t>Product</w:t>
+            </w:r>
+          </w:p>
+        </w:tc>
+        <w:tc>
+          <w:tcPr>
+            <w:tcW w:type="dxa" w:w="5083"/>
+          </w:tcPr>
+          <w:p>
+            <w:pPr>
+              <w:spacing w:after="40"/>
+            </w:pPr>
+            <w:r>
+              <w:rPr>
+                <w:b/>
+                <w:sz w:val="15"/>
+              </w:rPr>
+              <w:t>Exact placement</w:t>
+            </w:r>
+          </w:p>
+        </w:tc>
+      </w:tr>
+      <w:tr>
+        <w:tc>
+          <w:tcPr>
+            <w:tcW w:type="dxa" w:w="5083"/>
+          </w:tcPr>
+          <w:p>
+            <w:pPr>
+              <w:spacing w:after="40"/>
+            </w:pPr>
+            <w:r>
+              <w:rPr>
+                <w:sz w:val="15"/>
+              </w:rPr>
+              <w:t>ChatGPT web</w:t>
+            </w:r>
+          </w:p>
+        </w:tc>
+        <w:tc>
+          <w:tcPr>
+            <w:tcW w:type="dxa" w:w="5083"/>
+          </w:tcPr>
+          <w:p>
+            <w:pPr>
+              <w:spacing w:after="40"/>
+            </w:pPr>
+            <w:r>
+              <w:rPr>
+                <w:sz w:val="15"/>
+              </w:rPr>
+              <w:t>Profile menu → Settings → Personalization → Custom Instructions; turn on Enable customization, paste the text, and save. The ChatGPT desktop app uses the same settings route. On the mobile app, use Settings → Customize ChatGPT. A ChatGPT Project has its own Project settings instructions, which apply only inside that project. OpenAI Help · Projects</w:t>
+            </w:r>
+          </w:p>
+        </w:tc>
+      </w:tr>
+      <w:tr>
+        <w:tc>
+          <w:tcPr>
+            <w:tcW w:type="dxa" w:w="5083"/>
+          </w:tcPr>
+          <w:p>
+            <w:pPr>
+              <w:spacing w:after="40"/>
+            </w:pPr>
+            <w:r>
+              <w:rPr>
+                <w:sz w:val="15"/>
+              </w:rPr>
+              <w:t>Claude web and desktop chat</w:t>
+            </w:r>
+          </w:p>
+        </w:tc>
+        <w:tc>
+          <w:tcPr>
+            <w:tcW w:type="dxa" w:w="5083"/>
+          </w:tcPr>
+          <w:p>
+            <w:pPr>
+              <w:spacing w:after="40"/>
+            </w:pPr>
+            <w:r>
+              <w:rPr>
+                <w:sz w:val="15"/>
+              </w:rPr>
+              <w:t>Select your profile initials → Settings → Instructions for Claude; paste the text and save. This is Claude chat's account-wide setting, separate from Claude Code files. Claude Help</w:t>
+            </w:r>
+          </w:p>
+        </w:tc>
+      </w:tr>
+      <w:tr>
+        <w:tc>
+          <w:tcPr>
+            <w:tcW w:type="dxa" w:w="5083"/>
+          </w:tcPr>
+          <w:p>
+            <w:pPr>
+              <w:spacing w:after="40"/>
+            </w:pPr>
+            <w:r>
+              <w:rPr>
+                <w:sz w:val="15"/>
+              </w:rPr>
+              <w:t>Gemini web</w:t>
+            </w:r>
+          </w:p>
+        </w:tc>
+        <w:tc>
+          <w:tcPr>
+            <w:tcW w:type="dxa" w:w="5083"/>
+          </w:tcPr>
+          <w:p>
+            <w:pPr>
+              <w:spacing w:after="40"/>
+            </w:pPr>
+            <w:r>
+              <w:rPr>
+                <w:sz w:val="15"/>
+              </w:rPr>
+              <w:t>In gemini.google.com, open Menu → Settings &amp; help → Personal Intelligence → Instructions for Gemini → Add; paste the text and submit. On mobile, open Menu → profile → Personal Intelligence → Instructions for Gemini → Add. This feature depends on account eligibility; work, school, and supervised accounts may not have it. Gemini Help</w:t>
+            </w:r>
+          </w:p>
+        </w:tc>
+      </w:tr>
+      <w:tr>
+        <w:tc>
+          <w:tcPr>
+            <w:tcW w:type="dxa" w:w="5083"/>
+          </w:tcPr>
+          <w:p>
+            <w:pPr>
+              <w:spacing w:after="40"/>
+            </w:pPr>
+            <w:r>
+              <w:rPr>
+                <w:sz w:val="15"/>
+              </w:rPr>
+              <w:t>GitHub.com Copilot Chat</w:t>
+            </w:r>
+          </w:p>
+        </w:tc>
+        <w:tc>
+          <w:tcPr>
+            <w:tcW w:type="dxa" w:w="5083"/>
+          </w:tcPr>
+          <w:p>
+            <w:pPr>
+              <w:spacing w:after="40"/>
+            </w:pPr>
+            <w:r>
+              <w:rPr>
+                <w:sz w:val="15"/>
+              </w:rPr>
+              <w:t>Open Copilot Chat on GitHub, select your profile picture at the lower left → Personal instructions; paste the text and select Save. These personal instructions apply to Copilot Chat on GitHub.com, not automatically to an IDE. GitHub Docs</w:t>
+            </w:r>
+          </w:p>
+        </w:tc>
+      </w:tr>
+      <w:tr>
+        <w:tc>
+          <w:tcPr>
+            <w:tcW w:type="dxa" w:w="5083"/>
+          </w:tcPr>
+          <w:p>
+            <w:pPr>
+              <w:spacing w:after="40"/>
+            </w:pPr>
+            <w:r>
+              <w:rPr>
+                <w:sz w:val="15"/>
+              </w:rPr>
+              <w:t>Other Meta Muse apps</w:t>
+            </w:r>
+          </w:p>
+        </w:tc>
+        <w:tc>
+          <w:tcPr>
+            <w:tcW w:type="dxa" w:w="5083"/>
+          </w:tcPr>
+          <w:p>
+            <w:pPr>
+              <w:spacing w:after="40"/>
+            </w:pPr>
+            <w:r>
+              <w:rPr>
+                <w:sz w:val="15"/>
+              </w:rPr>
+              <w:t>Meta has not documented one persistent custom-instructions path that applies to every Muse app. If your version exposes personal instructions, use that field. Otherwise send the short instructions at the start of each chat and verify whether that surface can access local files. Muse Code configuration</w:t>
+            </w:r>
+          </w:p>
+        </w:tc>
+      </w:tr>
+    </w:tbl>
+    <w:p/>
+    <w:p>
+      <w:pPr>
+        <w:pStyle w:val="Heading2"/>
+      </w:pPr>
+      <w:r>
+        <w:t>Locally installed coding assistants and apps</w:t>
+      </w:r>
+    </w:p>
+    <w:p>
+      <w:r>
+        <w:t>For file-based settings, ~ means your home directory on macOS or Linux; on Windows it means %USERPROFILE%. Preserve existing instruction files and merge the text if they already contain rules. Open the AI Workshop directory as the active workspace when you want the app to discover its project instructions.</w:t>
       </w:r>
     </w:p>
     <w:tbl>
@@ -205,40 +453,6 @@
               <w:rPr>
                 <w:sz w:val="15"/>
               </w:rPr>
-              <w:t>ChatGPT</w:t>
-            </w:r>
-          </w:p>
-        </w:tc>
-        <w:tc>
-          <w:tcPr>
-            <w:tcW w:type="dxa" w:w="5083"/>
-          </w:tcPr>
-          <w:p>
-            <w:pPr>
-              <w:spacing w:after="40"/>
-            </w:pPr>
-            <w:r>
-              <w:rPr>
-                <w:sz w:val="15"/>
-              </w:rPr>
-              <w:t>Add the shared text to personal instructions. Use a local-capable Work or Codex session when a task needs local files or commands.</w:t>
-            </w:r>
-          </w:p>
-        </w:tc>
-      </w:tr>
-      <w:tr>
-        <w:tc>
-          <w:tcPr>
-            <w:tcW w:type="dxa" w:w="5083"/>
-          </w:tcPr>
-          <w:p>
-            <w:pPr>
-              <w:spacing w:after="40"/>
-            </w:pPr>
-            <w:r>
-              <w:rPr>
-                <w:sz w:val="15"/>
-              </w:rPr>
               <w:t>Codex app or CLI</w:t>
             </w:r>
           </w:p>
@@ -255,41 +469,7 @@
               <w:rPr>
                 <w:sz w:val="15"/>
               </w:rPr>
-              <w:t>Put it in the user-level AGENTS.md at ~/.codex/AGENTS.md on macOS/Linux or %USERPROFILE%\.codex\AGENTS.md on Windows. A fresh Workshop setup creates this file only when absent. Codex also reads the Workshop's own AGENTS.md when working there. OpenAI Docs</w:t>
-            </w:r>
-          </w:p>
-        </w:tc>
-      </w:tr>
-      <w:tr>
-        <w:tc>
-          <w:tcPr>
-            <w:tcW w:type="dxa" w:w="5083"/>
-          </w:tcPr>
-          <w:p>
-            <w:pPr>
-              <w:spacing w:after="40"/>
-            </w:pPr>
-            <w:r>
-              <w:rPr>
-                <w:sz w:val="15"/>
-              </w:rPr>
-              <w:t>Claude chat</w:t>
-            </w:r>
-          </w:p>
-        </w:tc>
-        <w:tc>
-          <w:tcPr>
-            <w:tcW w:type="dxa" w:w="5083"/>
-          </w:tcPr>
-          <w:p>
-            <w:pPr>
-              <w:spacing w:after="40"/>
-            </w:pPr>
-            <w:r>
-              <w:rPr>
-                <w:sz w:val="15"/>
-              </w:rPr>
-              <w:t>Open your profile Settings → Instructions for Claude and paste the text. This applies account-wide. Claude Help</w:t>
+              <w:t>Put the text in ~/.codex/AGENTS.md (Windows: %USERPROFILE%\.codex\AGENTS.md). Codex also reads the Workshop root AGENTS.md when working in that folder. ChatGPT's Custom Instructions field is not a substitute for this Codex file. OpenAI Docs</w:t>
             </w:r>
           </w:p>
         </w:tc>
@@ -324,40 +504,6 @@
                 <w:sz w:val="15"/>
               </w:rPr>
               <w:t>Put the text in ~/.claude/CLAUDE.md for user-wide use. Preserve any existing content and avoid duplicating conflicting rules. Claude Help</w:t>
-            </w:r>
-          </w:p>
-        </w:tc>
-      </w:tr>
-      <w:tr>
-        <w:tc>
-          <w:tcPr>
-            <w:tcW w:type="dxa" w:w="5083"/>
-          </w:tcPr>
-          <w:p>
-            <w:pPr>
-              <w:spacing w:after="40"/>
-            </w:pPr>
-            <w:r>
-              <w:rPr>
-                <w:sz w:val="15"/>
-              </w:rPr>
-              <w:t>Gemini app</w:t>
-            </w:r>
-          </w:p>
-        </w:tc>
-        <w:tc>
-          <w:tcPr>
-            <w:tcW w:type="dxa" w:w="5083"/>
-          </w:tcPr>
-          <w:p>
-            <w:pPr>
-              <w:spacing w:after="40"/>
-            </w:pPr>
-            <w:r>
-              <w:rPr>
-                <w:sz w:val="15"/>
-              </w:rPr>
-              <w:t>Open Settings &amp; help → Personal Intelligence → Instructions for Gemini → Add, then paste and submit. Availability depends on the account and app surface. Gemini Help</w:t>
             </w:r>
           </w:p>
         </w:tc>
@@ -443,40 +589,6 @@
               <w:rPr>
                 <w:sz w:val="15"/>
               </w:rPr>
-              <w:t>Other Meta Muse apps</w:t>
-            </w:r>
-          </w:p>
-        </w:tc>
-        <w:tc>
-          <w:tcPr>
-            <w:tcW w:type="dxa" w:w="5083"/>
-          </w:tcPr>
-          <w:p>
-            <w:pPr>
-              <w:spacing w:after="40"/>
-            </w:pPr>
-            <w:r>
-              <w:rPr>
-                <w:sz w:val="15"/>
-              </w:rPr>
-              <w:t>If that version offers a saved personal-instructions field, paste the same text there. Otherwise send it at the start of a conversation and do not assume it persists or has local file access. Meta's Muse announcement does not establish a universal persistent-instructions setting across every Muse surface.</w:t>
-            </w:r>
-          </w:p>
-        </w:tc>
-      </w:tr>
-      <w:tr>
-        <w:tc>
-          <w:tcPr>
-            <w:tcW w:type="dxa" w:w="5083"/>
-          </w:tcPr>
-          <w:p>
-            <w:pPr>
-              <w:spacing w:after="40"/>
-            </w:pPr>
-            <w:r>
-              <w:rPr>
-                <w:sz w:val="15"/>
-              </w:rPr>
               <w:t>OpenCode</w:t>
             </w:r>
           </w:p>
@@ -527,7 +639,7 @@
               <w:rPr>
                 <w:sz w:val="15"/>
               </w:rPr>
-              <w:t>Open the Workshop directory so Cursor reads its root AGENTS.md. For the same behavior in every project, paste the shared text into Cursor Settings → Rules → User Rules. Cursor does not gain access to a separate project merely because the rule names it; verify access in the active workspace. Cursor rules</w:t>
+              <w:t>Open Cursor Settings → Rules → User Rules and paste the text. Open the Workshop directory so Cursor can also read its root AGENTS.md. Cursor's account user rules and local file rules have different scopes; check access in the active workspace. Cursor rules</w:t>
             </w:r>
           </w:p>
         </w:tc>
@@ -600,40 +712,6 @@
           </w:p>
         </w:tc>
       </w:tr>
-      <w:tr>
-        <w:tc>
-          <w:tcPr>
-            <w:tcW w:type="dxa" w:w="5083"/>
-          </w:tcPr>
-          <w:p>
-            <w:pPr>
-              <w:spacing w:after="40"/>
-            </w:pPr>
-            <w:r>
-              <w:rPr>
-                <w:sz w:val="15"/>
-              </w:rPr>
-              <w:t>GitHub.com Copilot Chat</w:t>
-            </w:r>
-          </w:p>
-        </w:tc>
-        <w:tc>
-          <w:tcPr>
-            <w:tcW w:type="dxa" w:w="5083"/>
-          </w:tcPr>
-          <w:p>
-            <w:pPr>
-              <w:spacing w:after="40"/>
-            </w:pPr>
-            <w:r>
-              <w:rPr>
-                <w:sz w:val="15"/>
-              </w:rPr>
-              <w:t>Paste the shared text into Copilot Chat → profile picture → Personal instructions if you want it account-wide. GitHub.com Chat cannot read a Workshop folder on your computer without a connected local execution surface. GitHub personal instructions</w:t>
-            </w:r>
-          </w:p>
-        </w:tc>
-      </w:tr>
     </w:tbl>
     <w:p/>
     <w:p>
@@ -675,6 +753,114 @@
     <w:p>
       <w:r>
         <w:t>In a new local-capable chat, ask the assistant to identify and read the Workshop AGENTS.md and run doctor. It should report what it actually accessed and the check result. An instruction field alone does not complete installation. Use SHA256SUMS to check downloaded installers.</w:t>
+      </w:r>
+    </w:p>
+    <w:p>
+      <w:pPr>
+        <w:pStyle w:val="Heading1"/>
+      </w:pPr>
+      <w:r>
+        <w:t>Official source links</w:t>
+      </w:r>
+    </w:p>
+    <w:p>
+      <w:r>
+        <w:t>AI-Workshop-Windows-Setup.exe: https://github.com/scottwells83/ai-workshop/blob/main/current%20release/AI-Workshop-Windows-Setup.exe</w:t>
+      </w:r>
+    </w:p>
+    <w:p>
+      <w:r>
+        <w:t>AI-Workshop-macOS.dmg: https://github.com/scottwells83/ai-workshop/blob/main/current%20release/AI-Workshop-macOS.dmg</w:t>
+      </w:r>
+    </w:p>
+    <w:p>
+      <w:r>
+        <w:t>AI-Workshop-Linux-Setup.run: https://github.com/scottwells83/ai-workshop/blob/main/current%20release/AI-Workshop-Linux-Setup.run</w:t>
+      </w:r>
+    </w:p>
+    <w:p>
+      <w:r>
+        <w:t>Ollama: https://ollama.com/download</w:t>
+      </w:r>
+    </w:p>
+    <w:p>
+      <w:r>
+        <w:t>OpenAI Help: https://help.openai.com/en/articles/8096356-custom-instructions-for-chatgpt</w:t>
+      </w:r>
+    </w:p>
+    <w:p>
+      <w:r>
+        <w:t>Projects: https://help.openai.com/en/articles/10169521-using-projects-in-chatgpt</w:t>
+      </w:r>
+    </w:p>
+    <w:p>
+      <w:r>
+        <w:t>Claude Help: https://support.claude.com/en/articles/10185728-understanding-claude-s-personalization-features</w:t>
+      </w:r>
+    </w:p>
+    <w:p>
+      <w:r>
+        <w:t>Gemini Help: https://support.google.com/gemini/answer/16598625</w:t>
+      </w:r>
+    </w:p>
+    <w:p>
+      <w:r>
+        <w:t>GitHub Docs: https://docs.github.com/en/copilot/how-tos/copilot-on-github/customize-copilot/add-custom-instructions/add-personal-instructions</w:t>
+      </w:r>
+    </w:p>
+    <w:p>
+      <w:r>
+        <w:t>Muse Code configuration: https://dev.meta.ai/docs/muse-code/configuration</w:t>
+      </w:r>
+    </w:p>
+    <w:p>
+      <w:r>
+        <w:t>OpenAI Docs: https://developers.openai.com/cookbook/examples/gpt-5/codex_prompting_guide</w:t>
+      </w:r>
+    </w:p>
+    <w:p>
+      <w:r>
+        <w:t>Claude Help: https://support.claude.com/en/articles/14553240-give-claude-context-claude-md-and-better-prompts</w:t>
+      </w:r>
+    </w:p>
+    <w:p>
+      <w:r>
+        <w:t>Gemini CLI docs: https://geminicli.com/docs/cli/gemini-md/</w:t>
+      </w:r>
+    </w:p>
+    <w:p>
+      <w:r>
+        <w:t>official documentation: https://dev.meta.ai/docs/muse-code/configuration</w:t>
+      </w:r>
+    </w:p>
+    <w:p>
+      <w:r>
+        <w:t>OpenCode rules: https://docs.opencode.ai/docs/rules/</w:t>
+      </w:r>
+    </w:p>
+    <w:p>
+      <w:r>
+        <w:t>Ollama provider: https://opencode.ai/docs/providers</w:t>
+      </w:r>
+    </w:p>
+    <w:p>
+      <w:r>
+        <w:t>Cursor rules: https://cursor.com/docs/rules</w:t>
+      </w:r>
+    </w:p>
+    <w:p>
+      <w:r>
+        <w:t>GitHub support matrix: https://docs.github.com/en/copilot/reference/custom-instructions-support</w:t>
+      </w:r>
+    </w:p>
+    <w:p>
+      <w:r>
+        <w:t>Copilot CLI instructions: https://docs.github.com/en/copilot/how-tos/copilot-cli/customize-copilot/add-custom-instructions</w:t>
+      </w:r>
+    </w:p>
+    <w:p>
+      <w:r>
+        <w:t>SHA256SUMS: https://github.com/scottwells83/ai-workshop/blob/main/current%20release/SHA256SUMS</w:t>
       </w:r>
     </w:p>
     <w:sectPr>

</xml_diff>